<commit_message>
fix(dl): páginas reales en la guía del restaurante gastronómico (anunciaba 119) y la de dark kitchen (40)
Mismo defecto que el #162, cazado por paginas-gate al cerrarlo:
- Gastronómico: anunciaba 119 páginas en la ficha y 80+ en hubs y SPA. Su PDF era el texto real
  maquetado aparte (10 págs.); ahora se exporta del Word como las otras 6 (24 págs. A4; Word en A4,
  saltos y listas arreglados). Changelog 1.1.1.
- Dark kitchen: la ficha anunciaba 40 páginas y su PDF real tiene 27.
paginas-gate en todo el catálogo: 0 fallos.

Via: Claude Code
Co-Authored-By: Claude Opus 5.5 <noreply@anthropic.com>
</commit_message>
<xml_diff>
--- a/astro-site/public/dl/guia-restaurante-gastronomico/guia-restaurante-gastronomico.docx
+++ b/astro-site/public/dl/guia-restaurante-gastronomico/guia-restaurante-gastronomico.docx
@@ -49,13 +49,9 @@
       </w:r>
     </w:p>
     <w:p>
-      <w:r>
-        <w:br w:type="page"/>
-      </w:r>
-    </w:p>
-    <w:p>
       <w:pPr>
         <w:pStyle w:val="Heading1"/>
+        <w:pageBreakBefore/>
       </w:pPr>
       <w:r>
         <w:t>1. Qué es un Restaurante Gastronómico</w:t>
@@ -129,13 +125,9 @@
       </w:r>
     </w:p>
     <w:p>
-      <w:r>
-        <w:br w:type="page"/>
-      </w:r>
-    </w:p>
-    <w:p>
       <w:pPr>
         <w:pStyle w:val="Heading1"/>
+        <w:pageBreakBefore/>
       </w:pPr>
       <w:r>
         <w:t>2. El Mercado de la Alta Cocina en España 2026</w:t>
@@ -204,13 +196,9 @@
       </w:r>
     </w:p>
     <w:p>
-      <w:r>
-        <w:br w:type="page"/>
-      </w:r>
-    </w:p>
-    <w:p>
       <w:pPr>
         <w:pStyle w:val="Heading1"/>
+        <w:pageBreakBefore/>
       </w:pPr>
       <w:r>
         <w:t>3. Modelos de Negocio</w:t>
@@ -274,13 +262,9 @@
       </w:r>
     </w:p>
     <w:p>
-      <w:r>
-        <w:br w:type="page"/>
-      </w:r>
-    </w:p>
-    <w:p>
       <w:pPr>
         <w:pStyle w:val="Heading1"/>
+        <w:pageBreakBefore/>
       </w:pPr>
       <w:r>
         <w:t>4. Estudio de Viabilidad y Plan Financiero</w:t>
@@ -827,13 +811,9 @@
       </w:r>
     </w:p>
     <w:p>
-      <w:r>
-        <w:br w:type="page"/>
-      </w:r>
-    </w:p>
-    <w:p>
       <w:pPr>
         <w:pStyle w:val="Heading1"/>
+        <w:pageBreakBefore/>
       </w:pPr>
       <w:r>
         <w:t>5. Requisitos Legales en España</w:t>
@@ -958,13 +938,9 @@
       </w:r>
     </w:p>
     <w:p>
-      <w:r>
-        <w:br w:type="page"/>
-      </w:r>
-    </w:p>
-    <w:p>
       <w:pPr>
         <w:pStyle w:val="Heading1"/>
+        <w:pageBreakBefore/>
       </w:pPr>
       <w:r>
         <w:t>6. APPCC y Seguridad Alimentaria</w:t>
@@ -1101,13 +1077,9 @@
       </w:r>
     </w:p>
     <w:p>
-      <w:r>
-        <w:br w:type="page"/>
-      </w:r>
-    </w:p>
-    <w:p>
       <w:pPr>
         <w:pStyle w:val="Heading1"/>
+        <w:pageBreakBefore/>
       </w:pPr>
       <w:r>
         <w:t>7. Ubicación y Local</w:t>
@@ -1189,13 +1161,9 @@
       </w:r>
     </w:p>
     <w:p>
-      <w:r>
-        <w:br w:type="page"/>
-      </w:r>
-    </w:p>
-    <w:p>
       <w:pPr>
         <w:pStyle w:val="Heading1"/>
+        <w:pageBreakBefore/>
       </w:pPr>
       <w:r>
         <w:t>8. Diseño de Cocina Profesional</w:t>
@@ -1284,13 +1252,9 @@
       </w:r>
     </w:p>
     <w:p>
-      <w:r>
-        <w:br w:type="page"/>
-      </w:r>
-    </w:p>
-    <w:p>
       <w:pPr>
         <w:pStyle w:val="Heading1"/>
+        <w:pageBreakBefore/>
       </w:pPr>
       <w:r>
         <w:t>9. Equipamiento de Cocina</w:t>
@@ -1666,13 +1630,9 @@
       </w:tr>
     </w:tbl>
     <w:p>
-      <w:r>
-        <w:br w:type="page"/>
-      </w:r>
-    </w:p>
-    <w:p>
       <w:pPr>
         <w:pStyle w:val="Heading1"/>
+        <w:pageBreakBefore/>
       </w:pPr>
       <w:r>
         <w:t>10. Diseño de Sala para 65 Plazas</w:t>
@@ -1737,13 +1697,9 @@
       </w:r>
     </w:p>
     <w:p>
-      <w:r>
-        <w:br w:type="page"/>
-      </w:r>
-    </w:p>
-    <w:p>
       <w:pPr>
         <w:pStyle w:val="Heading1"/>
+        <w:pageBreakBefore/>
       </w:pPr>
       <w:r>
         <w:t>11. Vajilla, Cristalería y Cubertería Premium</w:t>
@@ -1796,13 +1752,9 @@
       </w:r>
     </w:p>
     <w:p>
-      <w:r>
-        <w:br w:type="page"/>
-      </w:r>
-    </w:p>
-    <w:p>
       <w:pPr>
         <w:pStyle w:val="Heading1"/>
+        <w:pageBreakBefore/>
       </w:pPr>
       <w:r>
         <w:t>12. Bodega y Servicio de Vinos</w:t>
@@ -1859,13 +1811,9 @@
       </w:r>
     </w:p>
     <w:p>
-      <w:r>
-        <w:br w:type="page"/>
-      </w:r>
-    </w:p>
-    <w:p>
       <w:pPr>
         <w:pStyle w:val="Heading1"/>
+        <w:pageBreakBefore/>
       </w:pPr>
       <w:r>
         <w:t>13. Brigada de Cocina (12-17 personas)</w:t>
@@ -2185,13 +2133,9 @@
       </w:r>
     </w:p>
     <w:p>
-      <w:r>
-        <w:br w:type="page"/>
-      </w:r>
-    </w:p>
-    <w:p>
       <w:pPr>
         <w:pStyle w:val="Heading1"/>
+        <w:pageBreakBefore/>
       </w:pPr>
       <w:r>
         <w:t>14. Equipo de Sala (9-12 personas)</w:t>
@@ -2469,13 +2413,9 @@
       </w:r>
     </w:p>
     <w:p>
-      <w:r>
-        <w:br w:type="page"/>
-      </w:r>
-    </w:p>
-    <w:p>
       <w:pPr>
         <w:pStyle w:val="Heading1"/>
+        <w:pageBreakBefore/>
       </w:pPr>
       <w:r>
         <w:t>15. Menú Engineering para Fine Dining</w:t>
@@ -2567,13 +2507,9 @@
       </w:r>
     </w:p>
     <w:p>
-      <w:r>
-        <w:br w:type="page"/>
-      </w:r>
-    </w:p>
-    <w:p>
       <w:pPr>
         <w:pStyle w:val="Heading1"/>
+        <w:pageBreakBefore/>
       </w:pPr>
       <w:r>
         <w:t>16. Proveedores Km0 y Producto de Temporada</w:t>
@@ -2617,13 +2553,9 @@
       </w:r>
     </w:p>
     <w:p>
-      <w:r>
-        <w:br w:type="page"/>
-      </w:r>
-    </w:p>
-    <w:p>
       <w:pPr>
         <w:pStyle w:val="Heading1"/>
+        <w:pageBreakBefore/>
       </w:pPr>
       <w:r>
         <w:t>17. Cómo Aspirar a Estrella Michelin</w:t>
@@ -2645,6 +2577,10 @@
     <w:p>
       <w:pPr>
         <w:pStyle w:val="ListNumber"/>
+        <w:numPr>
+          <w:ilvl w:val="0"/>
+          <w:numId w:val="10"/>
+        </w:numPr>
       </w:pPr>
       <w:r>
         <w:t>Calidad de los ingredientes: procedencia, frescura, trazabilidad.</w:t>
@@ -2653,6 +2589,10 @@
     <w:p>
       <w:pPr>
         <w:pStyle w:val="ListNumber"/>
+        <w:numPr>
+          <w:ilvl w:val="0"/>
+          <w:numId w:val="10"/>
+        </w:numPr>
       </w:pPr>
       <w:r>
         <w:t>Dominio de técnicas culinarias: precisión en cocciones, texturas, temperaturas.</w:t>
@@ -2661,6 +2601,10 @@
     <w:p>
       <w:pPr>
         <w:pStyle w:val="ListNumber"/>
+        <w:numPr>
+          <w:ilvl w:val="0"/>
+          <w:numId w:val="10"/>
+        </w:numPr>
       </w:pPr>
       <w:r>
         <w:t>Armonía de sabores: equilibrio, complejidad, limpieza de sabor.</w:t>
@@ -2669,6 +2613,10 @@
     <w:p>
       <w:pPr>
         <w:pStyle w:val="ListNumber"/>
+        <w:numPr>
+          <w:ilvl w:val="0"/>
+          <w:numId w:val="10"/>
+        </w:numPr>
       </w:pPr>
       <w:r>
         <w:t>Personalidad de la cocina: identidad propia, firma del chef, coherencia conceptual.</w:t>
@@ -2677,6 +2625,10 @@
     <w:p>
       <w:pPr>
         <w:pStyle w:val="ListNumber"/>
+        <w:numPr>
+          <w:ilvl w:val="0"/>
+          <w:numId w:val="10"/>
+        </w:numPr>
       </w:pPr>
       <w:r>
         <w:t>Consistencia: entre platos del menú y entre diferentes visitas.</w:t>
@@ -2703,13 +2655,9 @@
       </w:r>
     </w:p>
     <w:p>
-      <w:r>
-        <w:br w:type="page"/>
-      </w:r>
-    </w:p>
-    <w:p>
       <w:pPr>
         <w:pStyle w:val="Heading1"/>
+        <w:pageBreakBefore/>
       </w:pPr>
       <w:r>
         <w:t>18. Cómo Aspirar a Sol Repsol</w:t>
@@ -2799,13 +2747,9 @@
       </w:r>
     </w:p>
     <w:p>
-      <w:r>
-        <w:br w:type="page"/>
-      </w:r>
-    </w:p>
-    <w:p>
       <w:pPr>
         <w:pStyle w:val="Heading1"/>
+        <w:pageBreakBefore/>
       </w:pPr>
       <w:r>
         <w:t>19. The World's 50 Best</w:t>
@@ -2822,13 +2766,9 @@
       </w:r>
     </w:p>
     <w:p>
-      <w:r>
-        <w:br w:type="page"/>
-      </w:r>
-    </w:p>
-    <w:p>
       <w:pPr>
         <w:pStyle w:val="Heading1"/>
+        <w:pageBreakBefore/>
       </w:pPr>
       <w:r>
         <w:t>20. Marketing, PR y Lanzamiento</w:t>
@@ -2880,13 +2820,9 @@
       </w:r>
     </w:p>
     <w:p>
-      <w:r>
-        <w:br w:type="page"/>
-      </w:r>
-    </w:p>
-    <w:p>
       <w:pPr>
         <w:pStyle w:val="Heading1"/>
+        <w:pageBreakBefore/>
       </w:pPr>
       <w:r>
         <w:t>21. Tecnología para Fine Dining</w:t>
@@ -2957,13 +2893,9 @@
       </w:r>
     </w:p>
     <w:p>
-      <w:r>
-        <w:br w:type="page"/>
-      </w:r>
-    </w:p>
-    <w:p>
       <w:pPr>
         <w:pStyle w:val="Heading1"/>
+        <w:pageBreakBefore/>
       </w:pPr>
       <w:r>
         <w:t>22. Tendencias 2025-2026</w:t>
@@ -3077,7 +3009,7 @@
       </w:r>
     </w:p>
     <w:sectPr>
-      <w:pgSz w:w="12240" w:h="15840"/>
+      <w:pgSz w:w="11906" w:h="16838"/>
       <w:pgMar w:top="1440" w:right="1800" w:bottom="1440" w:left="1800" w:header="720" w:footer="720" w:gutter="0"/>
       <w:cols w:space="720"/>
       <w:docGrid w:linePitch="360"/>
@@ -3285,6 +3217,12 @@
   </w:num>
   <w:num w:numId="9">
     <w:abstractNumId w:val="0"/>
+  </w:num>
+  <w:num w:numId="10">
+    <w:abstractNumId w:val="7"/>
+    <w:lvlOverride w:ilvl="0">
+      <w:startOverride w:val="1"/>
+    </w:lvlOverride>
   </w:num>
 </w:numbering>
 </file>

</xml_diff>

<commit_message>
fix(dl): páginas reales en la guía del restaurante gastronómico (119 → 24) y dark kitchen (40 → 27) (#163)
Mismo defecto que el #162, cazado por paginas-gate al cerrarlo:
- Gastronómico: anunciaba 119 páginas en la ficha y 80+ en hubs y SPA. Su PDF era el texto real
  maquetado aparte (10 págs.); ahora se exporta del Word como las otras 6 (24 págs. A4; Word en A4,
  saltos y listas arreglados). Changelog 1.1.1.
- Dark kitchen: la ficha anunciaba 40 páginas y su PDF real tiene 27.
paginas-gate en todo el catálogo: 0 fallos.

Via: Claude Code

Co-authored-by: Claude Opus 5.5 <noreply@anthropic.com>
</commit_message>
<xml_diff>
--- a/astro-site/public/dl/guia-restaurante-gastronomico/guia-restaurante-gastronomico.docx
+++ b/astro-site/public/dl/guia-restaurante-gastronomico/guia-restaurante-gastronomico.docx
@@ -49,13 +49,9 @@
       </w:r>
     </w:p>
     <w:p>
-      <w:r>
-        <w:br w:type="page"/>
-      </w:r>
-    </w:p>
-    <w:p>
       <w:pPr>
         <w:pStyle w:val="Heading1"/>
+        <w:pageBreakBefore/>
       </w:pPr>
       <w:r>
         <w:t>1. Qué es un Restaurante Gastronómico</w:t>
@@ -129,13 +125,9 @@
       </w:r>
     </w:p>
     <w:p>
-      <w:r>
-        <w:br w:type="page"/>
-      </w:r>
-    </w:p>
-    <w:p>
       <w:pPr>
         <w:pStyle w:val="Heading1"/>
+        <w:pageBreakBefore/>
       </w:pPr>
       <w:r>
         <w:t>2. El Mercado de la Alta Cocina en España 2026</w:t>
@@ -204,13 +196,9 @@
       </w:r>
     </w:p>
     <w:p>
-      <w:r>
-        <w:br w:type="page"/>
-      </w:r>
-    </w:p>
-    <w:p>
       <w:pPr>
         <w:pStyle w:val="Heading1"/>
+        <w:pageBreakBefore/>
       </w:pPr>
       <w:r>
         <w:t>3. Modelos de Negocio</w:t>
@@ -274,13 +262,9 @@
       </w:r>
     </w:p>
     <w:p>
-      <w:r>
-        <w:br w:type="page"/>
-      </w:r>
-    </w:p>
-    <w:p>
       <w:pPr>
         <w:pStyle w:val="Heading1"/>
+        <w:pageBreakBefore/>
       </w:pPr>
       <w:r>
         <w:t>4. Estudio de Viabilidad y Plan Financiero</w:t>
@@ -827,13 +811,9 @@
       </w:r>
     </w:p>
     <w:p>
-      <w:r>
-        <w:br w:type="page"/>
-      </w:r>
-    </w:p>
-    <w:p>
       <w:pPr>
         <w:pStyle w:val="Heading1"/>
+        <w:pageBreakBefore/>
       </w:pPr>
       <w:r>
         <w:t>5. Requisitos Legales en España</w:t>
@@ -958,13 +938,9 @@
       </w:r>
     </w:p>
     <w:p>
-      <w:r>
-        <w:br w:type="page"/>
-      </w:r>
-    </w:p>
-    <w:p>
       <w:pPr>
         <w:pStyle w:val="Heading1"/>
+        <w:pageBreakBefore/>
       </w:pPr>
       <w:r>
         <w:t>6. APPCC y Seguridad Alimentaria</w:t>
@@ -1101,13 +1077,9 @@
       </w:r>
     </w:p>
     <w:p>
-      <w:r>
-        <w:br w:type="page"/>
-      </w:r>
-    </w:p>
-    <w:p>
       <w:pPr>
         <w:pStyle w:val="Heading1"/>
+        <w:pageBreakBefore/>
       </w:pPr>
       <w:r>
         <w:t>7. Ubicación y Local</w:t>
@@ -1189,13 +1161,9 @@
       </w:r>
     </w:p>
     <w:p>
-      <w:r>
-        <w:br w:type="page"/>
-      </w:r>
-    </w:p>
-    <w:p>
       <w:pPr>
         <w:pStyle w:val="Heading1"/>
+        <w:pageBreakBefore/>
       </w:pPr>
       <w:r>
         <w:t>8. Diseño de Cocina Profesional</w:t>
@@ -1284,13 +1252,9 @@
       </w:r>
     </w:p>
     <w:p>
-      <w:r>
-        <w:br w:type="page"/>
-      </w:r>
-    </w:p>
-    <w:p>
       <w:pPr>
         <w:pStyle w:val="Heading1"/>
+        <w:pageBreakBefore/>
       </w:pPr>
       <w:r>
         <w:t>9. Equipamiento de Cocina</w:t>
@@ -1666,13 +1630,9 @@
       </w:tr>
     </w:tbl>
     <w:p>
-      <w:r>
-        <w:br w:type="page"/>
-      </w:r>
-    </w:p>
-    <w:p>
       <w:pPr>
         <w:pStyle w:val="Heading1"/>
+        <w:pageBreakBefore/>
       </w:pPr>
       <w:r>
         <w:t>10. Diseño de Sala para 65 Plazas</w:t>
@@ -1737,13 +1697,9 @@
       </w:r>
     </w:p>
     <w:p>
-      <w:r>
-        <w:br w:type="page"/>
-      </w:r>
-    </w:p>
-    <w:p>
       <w:pPr>
         <w:pStyle w:val="Heading1"/>
+        <w:pageBreakBefore/>
       </w:pPr>
       <w:r>
         <w:t>11. Vajilla, Cristalería y Cubertería Premium</w:t>
@@ -1796,13 +1752,9 @@
       </w:r>
     </w:p>
     <w:p>
-      <w:r>
-        <w:br w:type="page"/>
-      </w:r>
-    </w:p>
-    <w:p>
       <w:pPr>
         <w:pStyle w:val="Heading1"/>
+        <w:pageBreakBefore/>
       </w:pPr>
       <w:r>
         <w:t>12. Bodega y Servicio de Vinos</w:t>
@@ -1859,13 +1811,9 @@
       </w:r>
     </w:p>
     <w:p>
-      <w:r>
-        <w:br w:type="page"/>
-      </w:r>
-    </w:p>
-    <w:p>
       <w:pPr>
         <w:pStyle w:val="Heading1"/>
+        <w:pageBreakBefore/>
       </w:pPr>
       <w:r>
         <w:t>13. Brigada de Cocina (12-17 personas)</w:t>
@@ -2185,13 +2133,9 @@
       </w:r>
     </w:p>
     <w:p>
-      <w:r>
-        <w:br w:type="page"/>
-      </w:r>
-    </w:p>
-    <w:p>
       <w:pPr>
         <w:pStyle w:val="Heading1"/>
+        <w:pageBreakBefore/>
       </w:pPr>
       <w:r>
         <w:t>14. Equipo de Sala (9-12 personas)</w:t>
@@ -2469,13 +2413,9 @@
       </w:r>
     </w:p>
     <w:p>
-      <w:r>
-        <w:br w:type="page"/>
-      </w:r>
-    </w:p>
-    <w:p>
       <w:pPr>
         <w:pStyle w:val="Heading1"/>
+        <w:pageBreakBefore/>
       </w:pPr>
       <w:r>
         <w:t>15. Menú Engineering para Fine Dining</w:t>
@@ -2567,13 +2507,9 @@
       </w:r>
     </w:p>
     <w:p>
-      <w:r>
-        <w:br w:type="page"/>
-      </w:r>
-    </w:p>
-    <w:p>
       <w:pPr>
         <w:pStyle w:val="Heading1"/>
+        <w:pageBreakBefore/>
       </w:pPr>
       <w:r>
         <w:t>16. Proveedores Km0 y Producto de Temporada</w:t>
@@ -2617,13 +2553,9 @@
       </w:r>
     </w:p>
     <w:p>
-      <w:r>
-        <w:br w:type="page"/>
-      </w:r>
-    </w:p>
-    <w:p>
       <w:pPr>
         <w:pStyle w:val="Heading1"/>
+        <w:pageBreakBefore/>
       </w:pPr>
       <w:r>
         <w:t>17. Cómo Aspirar a Estrella Michelin</w:t>
@@ -2645,6 +2577,10 @@
     <w:p>
       <w:pPr>
         <w:pStyle w:val="ListNumber"/>
+        <w:numPr>
+          <w:ilvl w:val="0"/>
+          <w:numId w:val="10"/>
+        </w:numPr>
       </w:pPr>
       <w:r>
         <w:t>Calidad de los ingredientes: procedencia, frescura, trazabilidad.</w:t>
@@ -2653,6 +2589,10 @@
     <w:p>
       <w:pPr>
         <w:pStyle w:val="ListNumber"/>
+        <w:numPr>
+          <w:ilvl w:val="0"/>
+          <w:numId w:val="10"/>
+        </w:numPr>
       </w:pPr>
       <w:r>
         <w:t>Dominio de técnicas culinarias: precisión en cocciones, texturas, temperaturas.</w:t>
@@ -2661,6 +2601,10 @@
     <w:p>
       <w:pPr>
         <w:pStyle w:val="ListNumber"/>
+        <w:numPr>
+          <w:ilvl w:val="0"/>
+          <w:numId w:val="10"/>
+        </w:numPr>
       </w:pPr>
       <w:r>
         <w:t>Armonía de sabores: equilibrio, complejidad, limpieza de sabor.</w:t>
@@ -2669,6 +2613,10 @@
     <w:p>
       <w:pPr>
         <w:pStyle w:val="ListNumber"/>
+        <w:numPr>
+          <w:ilvl w:val="0"/>
+          <w:numId w:val="10"/>
+        </w:numPr>
       </w:pPr>
       <w:r>
         <w:t>Personalidad de la cocina: identidad propia, firma del chef, coherencia conceptual.</w:t>
@@ -2677,6 +2625,10 @@
     <w:p>
       <w:pPr>
         <w:pStyle w:val="ListNumber"/>
+        <w:numPr>
+          <w:ilvl w:val="0"/>
+          <w:numId w:val="10"/>
+        </w:numPr>
       </w:pPr>
       <w:r>
         <w:t>Consistencia: entre platos del menú y entre diferentes visitas.</w:t>
@@ -2703,13 +2655,9 @@
       </w:r>
     </w:p>
     <w:p>
-      <w:r>
-        <w:br w:type="page"/>
-      </w:r>
-    </w:p>
-    <w:p>
       <w:pPr>
         <w:pStyle w:val="Heading1"/>
+        <w:pageBreakBefore/>
       </w:pPr>
       <w:r>
         <w:t>18. Cómo Aspirar a Sol Repsol</w:t>
@@ -2799,13 +2747,9 @@
       </w:r>
     </w:p>
     <w:p>
-      <w:r>
-        <w:br w:type="page"/>
-      </w:r>
-    </w:p>
-    <w:p>
       <w:pPr>
         <w:pStyle w:val="Heading1"/>
+        <w:pageBreakBefore/>
       </w:pPr>
       <w:r>
         <w:t>19. The World's 50 Best</w:t>
@@ -2822,13 +2766,9 @@
       </w:r>
     </w:p>
     <w:p>
-      <w:r>
-        <w:br w:type="page"/>
-      </w:r>
-    </w:p>
-    <w:p>
       <w:pPr>
         <w:pStyle w:val="Heading1"/>
+        <w:pageBreakBefore/>
       </w:pPr>
       <w:r>
         <w:t>20. Marketing, PR y Lanzamiento</w:t>
@@ -2880,13 +2820,9 @@
       </w:r>
     </w:p>
     <w:p>
-      <w:r>
-        <w:br w:type="page"/>
-      </w:r>
-    </w:p>
-    <w:p>
       <w:pPr>
         <w:pStyle w:val="Heading1"/>
+        <w:pageBreakBefore/>
       </w:pPr>
       <w:r>
         <w:t>21. Tecnología para Fine Dining</w:t>
@@ -2957,13 +2893,9 @@
       </w:r>
     </w:p>
     <w:p>
-      <w:r>
-        <w:br w:type="page"/>
-      </w:r>
-    </w:p>
-    <w:p>
       <w:pPr>
         <w:pStyle w:val="Heading1"/>
+        <w:pageBreakBefore/>
       </w:pPr>
       <w:r>
         <w:t>22. Tendencias 2025-2026</w:t>
@@ -3077,7 +3009,7 @@
       </w:r>
     </w:p>
     <w:sectPr>
-      <w:pgSz w:w="12240" w:h="15840"/>
+      <w:pgSz w:w="11906" w:h="16838"/>
       <w:pgMar w:top="1440" w:right="1800" w:bottom="1440" w:left="1800" w:header="720" w:footer="720" w:gutter="0"/>
       <w:cols w:space="720"/>
       <w:docGrid w:linePitch="360"/>
@@ -3285,6 +3217,12 @@
   </w:num>
   <w:num w:numId="9">
     <w:abstractNumId w:val="0"/>
+  </w:num>
+  <w:num w:numId="10">
+    <w:abstractNumId w:val="7"/>
+    <w:lvlOverride w:ilvl="0">
+      <w:startOverride w:val="1"/>
+    </w:lvlOverride>
   </w:num>
 </w:numbering>
 </file>

</xml_diff>